<commit_message>
Update terraform destroy evidence
</commit_message>
<xml_diff>
--- a/project/Course3 - Project 2 - Evidence.docx
+++ b/project/Course3 - Project 2 - Evidence.docx
@@ -78,6 +78,9 @@
     <w:p/>
     <w:p>
       <w:r>
+        <w:rPr>
+          <w:noProof/>
+        </w:rPr>
         <w:drawing>
           <wp:inline distT="0" distB="0" distL="0" distR="0" wp14:anchorId="6BDA9EC9" wp14:editId="3D0A86DF">
             <wp:extent cx="5731510" cy="1484630"/>
@@ -127,21 +130,15 @@
     <w:p/>
     <w:p>
       <w:r>
-        <w:t xml:space="preserve">There was an error received </w:t>
-      </w:r>
-      <w:r>
-        <w:t xml:space="preserve">(screenshot above) </w:t>
-      </w:r>
-      <w:r>
-        <w:t>during terraform apply due to incorrect availability zone mentioned in rds.tf. This was corrected and ‘terraform apply’ was used again. And it completed fine</w:t>
-      </w:r>
-      <w:r>
-        <w:t>. Screenshot below</w:t>
-      </w:r>
-    </w:p>
-    <w:p/>
-    <w:p>
-      <w:r>
+        <w:t>There was an error received (screenshot above) during terraform apply due to incorrect availability zone mentioned in rds.tf. This was corrected and ‘terraform apply’ was used again. And it completed fine. Screenshot below</w:t>
+      </w:r>
+    </w:p>
+    <w:p/>
+    <w:p>
+      <w:r>
+        <w:rPr>
+          <w:noProof/>
+        </w:rPr>
         <w:drawing>
           <wp:inline distT="0" distB="0" distL="0" distR="0" wp14:anchorId="57E4EA9C" wp14:editId="04093519">
             <wp:extent cx="5731510" cy="3221355"/>
@@ -193,6 +190,9 @@
     </w:p>
     <w:p>
       <w:r>
+        <w:rPr>
+          <w:noProof/>
+        </w:rPr>
         <w:drawing>
           <wp:inline distT="0" distB="0" distL="0" distR="0" wp14:anchorId="4DB377E4" wp14:editId="25C04450">
             <wp:extent cx="5731510" cy="2773045"/>
@@ -232,6 +232,9 @@
     </w:p>
     <w:p>
       <w:r>
+        <w:rPr>
+          <w:noProof/>
+        </w:rPr>
         <w:drawing>
           <wp:inline distT="0" distB="0" distL="0" distR="0" wp14:anchorId="59DE2016" wp14:editId="7D0E9DFA">
             <wp:extent cx="5731510" cy="2764155"/>
@@ -272,6 +275,9 @@
     <w:p/>
     <w:p>
       <w:r>
+        <w:rPr>
+          <w:noProof/>
+        </w:rPr>
         <w:lastRenderedPageBreak/>
         <w:drawing>
           <wp:inline distT="0" distB="0" distL="0" distR="0" wp14:anchorId="04CFA975" wp14:editId="71CD916F">
@@ -312,6 +318,9 @@
     </w:p>
     <w:p>
       <w:r>
+        <w:rPr>
+          <w:noProof/>
+        </w:rPr>
         <w:drawing>
           <wp:inline distT="0" distB="0" distL="0" distR="0" wp14:anchorId="15A10E78" wp14:editId="7D98E72F">
             <wp:extent cx="5731510" cy="2773045"/>
@@ -363,17 +372,14 @@
     <w:p>
       <w:r>
         <w:lastRenderedPageBreak/>
-        <w:t xml:space="preserve">Zone </w:t>
-      </w:r>
-      <w:r>
-        <w:t>2</w:t>
-      </w:r>
-      <w:r>
-        <w:t xml:space="preserve"> -Terraform Deploy</w:t>
-      </w:r>
-    </w:p>
-    <w:p>
-      <w:r>
+        <w:t>Zone 2 -Terraform Deploy</w:t>
+      </w:r>
+    </w:p>
+    <w:p>
+      <w:r>
+        <w:rPr>
+          <w:noProof/>
+        </w:rPr>
         <w:drawing>
           <wp:inline distT="0" distB="0" distL="0" distR="0" wp14:anchorId="10B52751" wp14:editId="6254071B">
             <wp:extent cx="5731510" cy="3221355"/>
@@ -413,25 +419,16 @@
     </w:p>
     <w:p>
       <w:r>
-        <w:t>Below are the screenshots of the Infra created in region ‘us-</w:t>
-      </w:r>
-      <w:r>
-        <w:t>west</w:t>
-      </w:r>
-      <w:r>
-        <w:t>-</w:t>
-      </w:r>
-      <w:r>
-        <w:t>1</w:t>
-      </w:r>
-      <w:r>
-        <w:t>’</w:t>
-      </w:r>
-    </w:p>
-    <w:p/>
-    <w:p/>
-    <w:p>
-      <w:r>
+        <w:t>Below are the screenshots of the Infra created in region ‘us-west-1’</w:t>
+      </w:r>
+    </w:p>
+    <w:p/>
+    <w:p/>
+    <w:p>
+      <w:r>
+        <w:rPr>
+          <w:noProof/>
+        </w:rPr>
         <w:drawing>
           <wp:inline distT="0" distB="0" distL="0" distR="0" wp14:anchorId="5738F53D" wp14:editId="59185C77">
             <wp:extent cx="5731510" cy="2767330"/>
@@ -474,6 +471,9 @@
     <w:p/>
     <w:p>
       <w:r>
+        <w:rPr>
+          <w:noProof/>
+        </w:rPr>
         <w:lastRenderedPageBreak/>
         <w:drawing>
           <wp:inline distT="0" distB="0" distL="0" distR="0" wp14:anchorId="09F9E832" wp14:editId="3CD64FE0">
@@ -515,6 +515,9 @@
     <w:p/>
     <w:p>
       <w:r>
+        <w:rPr>
+          <w:noProof/>
+        </w:rPr>
         <w:drawing>
           <wp:inline distT="0" distB="0" distL="0" distR="0" wp14:anchorId="4D22DB94" wp14:editId="612D1EC8">
             <wp:extent cx="5731510" cy="2775585"/>
@@ -554,6 +557,9 @@
     </w:p>
     <w:p>
       <w:r>
+        <w:rPr>
+          <w:noProof/>
+        </w:rPr>
         <w:drawing>
           <wp:inline distT="0" distB="0" distL="0" distR="0" wp14:anchorId="151D9506" wp14:editId="795D9617">
             <wp:extent cx="5731510" cy="2757805"/>
@@ -595,6 +601,9 @@
     <w:p/>
     <w:p>
       <w:r>
+        <w:rPr>
+          <w:noProof/>
+        </w:rPr>
         <w:drawing>
           <wp:inline distT="0" distB="0" distL="0" distR="0" wp14:anchorId="16C41E8D" wp14:editId="1CF354EB">
             <wp:extent cx="5731510" cy="2794000"/>
@@ -632,6 +641,197 @@
         </w:drawing>
       </w:r>
     </w:p>
+    <w:p/>
+    <w:p>
+      <w:r>
+        <w:t> </w:t>
+      </w:r>
+      <w:r>
+        <w:t>D</w:t>
+      </w:r>
+      <w:r>
+        <w:t>estroy the specific AWS RDS cluster resource</w:t>
+      </w:r>
+      <w:r>
+        <w:t xml:space="preserve"> (zone 1)</w:t>
+      </w:r>
+    </w:p>
+    <w:p>
+      <w:r>
+        <w:drawing>
+          <wp:inline distT="0" distB="0" distL="0" distR="0" wp14:anchorId="204EE6F5" wp14:editId="574D2F11">
+            <wp:extent cx="5731510" cy="2783205"/>
+            <wp:effectExtent l="0" t="0" r="2540" b="0"/>
+            <wp:docPr id="1276428207" name="Picture 1" descr="A screenshot of a computer&#10;&#10;AI-generated content may be incorrect."/>
+            <wp:cNvGraphicFramePr>
+              <a:graphicFrameLocks xmlns:a="http://schemas.openxmlformats.org/drawingml/2006/main" noChangeAspect="1"/>
+            </wp:cNvGraphicFramePr>
+            <a:graphic xmlns:a="http://schemas.openxmlformats.org/drawingml/2006/main">
+              <a:graphicData uri="http://schemas.openxmlformats.org/drawingml/2006/picture">
+                <pic:pic xmlns:pic="http://schemas.openxmlformats.org/drawingml/2006/picture">
+                  <pic:nvPicPr>
+                    <pic:cNvPr id="1276428207" name="Picture 1" descr="A screenshot of a computer&#10;&#10;AI-generated content may be incorrect."/>
+                    <pic:cNvPicPr/>
+                  </pic:nvPicPr>
+                  <pic:blipFill>
+                    <a:blip r:embed="rId17"/>
+                    <a:stretch>
+                      <a:fillRect/>
+                    </a:stretch>
+                  </pic:blipFill>
+                  <pic:spPr>
+                    <a:xfrm>
+                      <a:off x="0" y="0"/>
+                      <a:ext cx="5731510" cy="2783205"/>
+                    </a:xfrm>
+                    <a:prstGeom prst="rect">
+                      <a:avLst/>
+                    </a:prstGeom>
+                  </pic:spPr>
+                </pic:pic>
+              </a:graphicData>
+            </a:graphic>
+          </wp:inline>
+        </w:drawing>
+      </w:r>
+    </w:p>
+    <w:p/>
+    <w:p>
+      <w:r>
+        <w:lastRenderedPageBreak/>
+        <w:drawing>
+          <wp:inline distT="0" distB="0" distL="0" distR="0" wp14:anchorId="3527992D" wp14:editId="1FDFA4A9">
+            <wp:extent cx="5731510" cy="2769870"/>
+            <wp:effectExtent l="0" t="0" r="2540" b="0"/>
+            <wp:docPr id="2141294093" name="Picture 1" descr="A screenshot of a computer&#10;&#10;AI-generated content may be incorrect."/>
+            <wp:cNvGraphicFramePr>
+              <a:graphicFrameLocks xmlns:a="http://schemas.openxmlformats.org/drawingml/2006/main" noChangeAspect="1"/>
+            </wp:cNvGraphicFramePr>
+            <a:graphic xmlns:a="http://schemas.openxmlformats.org/drawingml/2006/main">
+              <a:graphicData uri="http://schemas.openxmlformats.org/drawingml/2006/picture">
+                <pic:pic xmlns:pic="http://schemas.openxmlformats.org/drawingml/2006/picture">
+                  <pic:nvPicPr>
+                    <pic:cNvPr id="2141294093" name="Picture 1" descr="A screenshot of a computer&#10;&#10;AI-generated content may be incorrect."/>
+                    <pic:cNvPicPr/>
+                  </pic:nvPicPr>
+                  <pic:blipFill>
+                    <a:blip r:embed="rId18"/>
+                    <a:stretch>
+                      <a:fillRect/>
+                    </a:stretch>
+                  </pic:blipFill>
+                  <pic:spPr>
+                    <a:xfrm>
+                      <a:off x="0" y="0"/>
+                      <a:ext cx="5731510" cy="2769870"/>
+                    </a:xfrm>
+                    <a:prstGeom prst="rect">
+                      <a:avLst/>
+                    </a:prstGeom>
+                  </pic:spPr>
+                </pic:pic>
+              </a:graphicData>
+            </a:graphic>
+          </wp:inline>
+        </w:drawing>
+      </w:r>
+    </w:p>
+    <w:p>
+      <w:r>
+        <w:drawing>
+          <wp:inline distT="0" distB="0" distL="0" distR="0" wp14:anchorId="4DD054BC" wp14:editId="707C946A">
+            <wp:extent cx="5731510" cy="3221355"/>
+            <wp:effectExtent l="0" t="0" r="2540" b="0"/>
+            <wp:docPr id="537316523" name="Picture 1" descr="A screenshot of a computer screen&#10;&#10;AI-generated content may be incorrect."/>
+            <wp:cNvGraphicFramePr>
+              <a:graphicFrameLocks xmlns:a="http://schemas.openxmlformats.org/drawingml/2006/main" noChangeAspect="1"/>
+            </wp:cNvGraphicFramePr>
+            <a:graphic xmlns:a="http://schemas.openxmlformats.org/drawingml/2006/main">
+              <a:graphicData uri="http://schemas.openxmlformats.org/drawingml/2006/picture">
+                <pic:pic xmlns:pic="http://schemas.openxmlformats.org/drawingml/2006/picture">
+                  <pic:nvPicPr>
+                    <pic:cNvPr id="537316523" name="Picture 1" descr="A screenshot of a computer screen&#10;&#10;AI-generated content may be incorrect."/>
+                    <pic:cNvPicPr/>
+                  </pic:nvPicPr>
+                  <pic:blipFill>
+                    <a:blip r:embed="rId19"/>
+                    <a:stretch>
+                      <a:fillRect/>
+                    </a:stretch>
+                  </pic:blipFill>
+                  <pic:spPr>
+                    <a:xfrm>
+                      <a:off x="0" y="0"/>
+                      <a:ext cx="5731510" cy="3221355"/>
+                    </a:xfrm>
+                    <a:prstGeom prst="rect">
+                      <a:avLst/>
+                    </a:prstGeom>
+                  </pic:spPr>
+                </pic:pic>
+              </a:graphicData>
+            </a:graphic>
+          </wp:inline>
+        </w:drawing>
+      </w:r>
+    </w:p>
+    <w:p/>
+    <w:p/>
+    <w:p/>
+    <w:p/>
+    <w:p/>
+    <w:p/>
+    <w:p/>
+    <w:p/>
+    <w:p/>
+    <w:p>
+      <w:r>
+        <w:lastRenderedPageBreak/>
+        <w:t>Destroy All Resources in Zone 2 Folder</w:t>
+      </w:r>
+    </w:p>
+    <w:p>
+      <w:r>
+        <w:drawing>
+          <wp:inline distT="0" distB="0" distL="0" distR="0" wp14:anchorId="4C65FE3D" wp14:editId="08BD99BA">
+            <wp:extent cx="5731510" cy="3221355"/>
+            <wp:effectExtent l="0" t="0" r="2540" b="0"/>
+            <wp:docPr id="2039723117" name="Picture 1"/>
+            <wp:cNvGraphicFramePr>
+              <a:graphicFrameLocks xmlns:a="http://schemas.openxmlformats.org/drawingml/2006/main" noChangeAspect="1"/>
+            </wp:cNvGraphicFramePr>
+            <a:graphic xmlns:a="http://schemas.openxmlformats.org/drawingml/2006/main">
+              <a:graphicData uri="http://schemas.openxmlformats.org/drawingml/2006/picture">
+                <pic:pic xmlns:pic="http://schemas.openxmlformats.org/drawingml/2006/picture">
+                  <pic:nvPicPr>
+                    <pic:cNvPr id="2039723117" name=""/>
+                    <pic:cNvPicPr/>
+                  </pic:nvPicPr>
+                  <pic:blipFill>
+                    <a:blip r:embed="rId20"/>
+                    <a:stretch>
+                      <a:fillRect/>
+                    </a:stretch>
+                  </pic:blipFill>
+                  <pic:spPr>
+                    <a:xfrm>
+                      <a:off x="0" y="0"/>
+                      <a:ext cx="5731510" cy="3221355"/>
+                    </a:xfrm>
+                    <a:prstGeom prst="rect">
+                      <a:avLst/>
+                    </a:prstGeom>
+                  </pic:spPr>
+                </pic:pic>
+              </a:graphicData>
+            </a:graphic>
+          </wp:inline>
+        </w:drawing>
+      </w:r>
+    </w:p>
+    <w:p/>
+    <w:p/>
+    <w:p/>
     <w:sectPr>
       <w:pgSz w:w="11906" w:h="16838"/>
       <w:pgMar w:top="1440" w:right="1440" w:bottom="1440" w:left="1440" w:header="708" w:footer="708" w:gutter="0"/>
@@ -1093,7 +1293,6 @@
     <w:next w:val="Normal"/>
     <w:link w:val="Heading3Char"/>
     <w:uiPriority w:val="9"/>
-    <w:semiHidden/>
     <w:unhideWhenUsed/>
     <w:qFormat/>
     <w:rsid w:val="00294A2F"/>
@@ -1245,7 +1444,6 @@
   <w:style w:type="character" w:default="1" w:styleId="DefaultParagraphFont">
     <w:name w:val="Default Paragraph Font"/>
     <w:uiPriority w:val="1"/>
-    <w:semiHidden/>
     <w:unhideWhenUsed/>
   </w:style>
   <w:style w:type="table" w:default="1" w:styleId="TableNormal">
@@ -1301,7 +1499,6 @@
     <w:basedOn w:val="DefaultParagraphFont"/>
     <w:link w:val="Heading3"/>
     <w:uiPriority w:val="9"/>
-    <w:semiHidden/>
     <w:rsid w:val="00294A2F"/>
     <w:rPr>
       <w:rFonts w:eastAsiaTheme="majorEastAsia" w:cstheme="majorBidi"/>

</xml_diff>